<commit_message>
CV générique: puces d'expérience reformulées (compétences transférables)
</commit_message>
<xml_diff>
--- a/CV/AIT_AMIR_Youssouf_CV_Generique.docx
+++ b/CV/AIT_AMIR_Youssouf_CV_Generique.docx
@@ -430,7 +430,7 @@
           <w:sz w:val="19"/>
           <w:szCs w:val="19"/>
         </w:rPr>
-        <w:t xml:space="preserve">▸  Accueil, écoute et accompagnement des clients dans la résolution de leurs demandes</w:t>
+        <w:t xml:space="preserve">▸  Rigueur et sang-froid sur des interventions à enjeux réels, sans marge d’erreur tolérée</w:t>
       </w:r>
     </w:p>
     <w:p>
@@ -445,7 +445,7 @@
           <w:sz w:val="19"/>
           <w:szCs w:val="19"/>
         </w:rPr>
-        <w:t xml:space="preserve">▸  Gestion autonome de tâches, respect des délais et des consignes en environnement professionnel</w:t>
+        <w:t xml:space="preserve">▸  Prise en main rapide de missions concrètes sur des outils et équipements inconnus</w:t>
       </w:r>
     </w:p>
     <w:p>

</xml_diff>

<commit_message>
Mise à jour CV générique : ajout DevOps/CI-CD, informatique décisionnelle, simplification langues
</commit_message>
<xml_diff>
--- a/CV/AIT_AMIR_Youssouf_CV_Generique.docx
+++ b/CV/AIT_AMIR_Youssouf_CV_Generique.docx
@@ -4,32 +4,30 @@
   <w:body>
     <w:p>
       <w:pPr>
-        <w:spacing w:after="40"/>
+        <w:spacing w:after="20"/>
         <w:jc w:val="center"/>
       </w:pPr>
       <w:r>
         <w:rPr>
-          <w:rFonts w:ascii="Calibri" w:cs="Calibri" w:eastAsia="Calibri" w:hAnsi="Calibri"/>
-          <w:b/>
-          <w:bCs/>
-          <w:color w:val="1F3F52"/>
-          <w:sz w:val="40"/>
-          <w:szCs w:val="40"/>
+          <w:b/>
+          <w:bCs/>
+          <w:color w:val="2C3E50"/>
+          <w:sz w:val="34"/>
+          <w:szCs w:val="34"/>
         </w:rPr>
         <w:t xml:space="preserve">AIT AMIR Youssouf</w:t>
       </w:r>
     </w:p>
     <w:p>
       <w:pPr>
-        <w:spacing w:after="220"/>
+        <w:spacing w:after="200"/>
         <w:jc w:val="center"/>
       </w:pPr>
       <w:r>
         <w:rPr>
-          <w:rFonts w:ascii="Calibri" w:cs="Calibri" w:eastAsia="Calibri" w:hAnsi="Calibri"/>
           <w:color w:val="808080"/>
-          <w:sz w:val="26"/>
-          <w:szCs w:val="26"/>
+          <w:sz w:val="21"/>
+          <w:szCs w:val="21"/>
         </w:rPr>
         <w:t xml:space="preserve">Curriculum Vitae</w:t>
       </w:r>
@@ -38,12 +36,12 @@
       <w:tblPr>
         <w:tblW w:type="pct" w:w="100%"/>
         <w:tblBorders>
-          <w:top w:val="none" w:color="FFFFFF" w:sz="0"/>
-          <w:left w:val="none" w:color="FFFFFF" w:sz="0"/>
-          <w:bottom w:val="none" w:color="FFFFFF" w:sz="0"/>
-          <w:right w:val="none" w:color="FFFFFF" w:sz="0"/>
-          <w:insideH w:val="none" w:color="FFFFFF" w:sz="0"/>
-          <w:insideV w:val="none" w:color="FFFFFF" w:sz="0"/>
+          <w:top w:val="none"/>
+          <w:left w:val="none"/>
+          <w:bottom w:val="none"/>
+          <w:right w:val="none"/>
+          <w:insideH w:val="none"/>
+          <w:insideV w:val="none"/>
         </w:tblBorders>
       </w:tblPr>
       <w:tblGrid>
@@ -58,10 +56,8 @@
           <w:p>
             <w:r>
               <w:rPr>
-                <w:rFonts w:ascii="Calibri" w:cs="Calibri" w:eastAsia="Calibri" w:hAnsi="Calibri"/>
-                <w:color w:val="262626"/>
-                <w:sz w:val="19"/>
-                <w:szCs w:val="19"/>
+                <w:sz w:val="20"/>
+                <w:szCs w:val="20"/>
               </w:rPr>
               <w:t xml:space="preserve">07 80 75 07 19</w:t>
             </w:r>
@@ -69,10 +65,8 @@
           <w:p>
             <w:r>
               <w:rPr>
-                <w:rFonts w:ascii="Calibri" w:cs="Calibri" w:eastAsia="Calibri" w:hAnsi="Calibri"/>
-                <w:color w:val="262626"/>
-                <w:sz w:val="19"/>
-                <w:szCs w:val="19"/>
+                <w:sz w:val="20"/>
+                <w:szCs w:val="20"/>
               </w:rPr>
               <w:t xml:space="preserve">youssouf.tzvn@gmail.com</w:t>
             </w:r>
@@ -88,10 +82,8 @@
             </w:pPr>
             <w:r>
               <w:rPr>
-                <w:rFonts w:ascii="Calibri" w:cs="Calibri" w:eastAsia="Calibri" w:hAnsi="Calibri"/>
-                <w:color w:val="262626"/>
-                <w:sz w:val="19"/>
-                <w:szCs w:val="19"/>
+                <w:sz w:val="20"/>
+                <w:szCs w:val="20"/>
               </w:rPr>
               <w:t xml:space="preserve">La Madeleine (59)</w:t>
             </w:r>
@@ -102,10 +94,8 @@
             </w:pPr>
             <w:r>
               <w:rPr>
-                <w:rFonts w:ascii="Calibri" w:cs="Calibri" w:eastAsia="Calibri" w:hAnsi="Calibri"/>
-                <w:color w:val="262626"/>
-                <w:sz w:val="19"/>
-                <w:szCs w:val="19"/>
+                <w:sz w:val="20"/>
+                <w:szCs w:val="20"/>
               </w:rPr>
               <w:t xml:space="preserve">Nationalité Française</w:t>
             </w:r>
@@ -115,27 +105,23 @@
     </w:tbl>
     <w:p>
       <w:pPr>
+        <w:spacing w:after="160"/>
+      </w:pPr>
+    </w:p>
+    <w:p>
+      <w:pPr>
         <w:pBdr>
-          <w:bottom w:val="single" w:color="BFCCD1" w:sz="4" w:space="1"/>
+          <w:bottom w:val="single" w:color="BFBFBF" w:sz="4" w:space="4"/>
         </w:pBdr>
-        <w:spacing w:after="60" w:before="120"/>
-      </w:pPr>
-    </w:p>
-    <w:p>
-      <w:pPr>
-        <w:pBdr>
-          <w:bottom w:val="single" w:color="BFCCD1" w:sz="4" w:space="4"/>
-        </w:pBdr>
-        <w:spacing w:after="100" w:before="280"/>
-      </w:pPr>
-      <w:r>
-        <w:rPr>
-          <w:rFonts w:ascii="Calibri" w:cs="Calibri" w:eastAsia="Calibri" w:hAnsi="Calibri"/>
-          <w:b/>
-          <w:bCs/>
-          <w:color w:val="1F3F52"/>
-          <w:sz w:val="24"/>
-          <w:szCs w:val="24"/>
+        <w:spacing w:after="100" w:before="260"/>
+      </w:pPr>
+      <w:r>
+        <w:rPr>
+          <w:b/>
+          <w:bCs/>
+          <w:color w:val="2C3E50"/>
+          <w:sz w:val="22"/>
+          <w:szCs w:val="22"/>
         </w:rPr>
         <w:t xml:space="preserve">FORMATION</w:t>
       </w:r>
@@ -143,16 +129,14 @@
     <w:p>
       <w:pPr>
         <w:tabs>
-          <w:tab w:val="right" w:pos="9936"/>
+          <w:tab w:val="right" w:pos="9360"/>
         </w:tabs>
-        <w:spacing w:after="10" w:before="140"/>
-      </w:pPr>
-      <w:r>
-        <w:rPr>
-          <w:rFonts w:ascii="Calibri" w:cs="Calibri" w:eastAsia="Calibri" w:hAnsi="Calibri"/>
-          <w:b/>
-          <w:bCs/>
-          <w:color w:val="1A1A1A"/>
+        <w:spacing w:after="0" w:before="140"/>
+      </w:pPr>
+      <w:r>
+        <w:rPr>
+          <w:b/>
+          <w:bCs/>
           <w:sz w:val="21"/>
           <w:szCs w:val="21"/>
         </w:rPr>
@@ -160,7 +144,6 @@
       </w:r>
       <w:r>
         <w:rPr>
-          <w:rFonts w:ascii="Calibri" w:cs="Calibri" w:eastAsia="Calibri" w:hAnsi="Calibri"/>
           <w:i/>
           <w:iCs/>
           <w:color w:val="808080"/>
@@ -172,14 +155,13 @@
     </w:p>
     <w:p>
       <w:pPr>
-        <w:spacing w:after="50"/>
-      </w:pPr>
-      <w:r>
-        <w:rPr>
-          <w:rFonts w:ascii="Calibri" w:cs="Calibri" w:eastAsia="Calibri" w:hAnsi="Calibri"/>
+        <w:spacing w:after="40"/>
+      </w:pPr>
+      <w:r>
+        <w:rPr>
           <w:i/>
           <w:iCs/>
-          <w:color w:val="4A7B93"/>
+          <w:color w:val="5B7A8C"/>
           <w:sz w:val="19"/>
           <w:szCs w:val="19"/>
         </w:rPr>
@@ -188,47 +170,106 @@
     </w:p>
     <w:p>
       <w:pPr>
-        <w:spacing w:after="30"/>
-        <w:ind w:left="316"/>
-      </w:pPr>
-      <w:r>
-        <w:rPr>
-          <w:rFonts w:ascii="Calibri" w:cs="Calibri" w:eastAsia="Calibri" w:hAnsi="Calibri"/>
-          <w:color w:val="262626"/>
-          <w:sz w:val="19"/>
-          <w:szCs w:val="19"/>
-        </w:rPr>
-        <w:t xml:space="preserve">▸  Formation exigeant rigueur, méthode et respect des procédures</w:t>
-      </w:r>
-    </w:p>
-    <w:p>
-      <w:pPr>
-        <w:spacing w:after="30"/>
-        <w:ind w:left="316"/>
-      </w:pPr>
-      <w:r>
-        <w:rPr>
-          <w:rFonts w:ascii="Calibri" w:cs="Calibri" w:eastAsia="Calibri" w:hAnsi="Calibri"/>
-          <w:color w:val="262626"/>
-          <w:sz w:val="19"/>
-          <w:szCs w:val="19"/>
-        </w:rPr>
-        <w:t xml:space="preserve">▸  Développement de l'autonomie, du travail en équipe et de la capacité d'analyse</w:t>
+        <w:spacing w:after="20"/>
+        <w:ind w:left="403"/>
+      </w:pPr>
+      <w:r>
+        <w:rPr>
+          <w:sz w:val="20"/>
+          <w:szCs w:val="20"/>
+        </w:rPr>
+        <w:t xml:space="preserve">▸ Formation exigeant rigueur, méthode et respect des procédures</w:t>
+      </w:r>
+    </w:p>
+    <w:p>
+      <w:pPr>
+        <w:spacing w:after="20"/>
+        <w:ind w:left="403"/>
+      </w:pPr>
+      <w:r>
+        <w:rPr>
+          <w:sz w:val="20"/>
+          <w:szCs w:val="20"/>
+        </w:rPr>
+        <w:t xml:space="preserve">▸ Développement de l'autonomie, du travail en équipe et de la capacité d'analyse</w:t>
+      </w:r>
+    </w:p>
+    <w:p>
+      <w:pPr>
+        <w:spacing w:after="20"/>
+        <w:ind w:left="403"/>
+      </w:pPr>
+      <w:r>
+        <w:rPr>
+          <w:sz w:val="20"/>
+          <w:szCs w:val="20"/>
+        </w:rPr>
+        <w:t xml:space="preserve">▸ Compétences informatiques : systèmes, réseaux et programmation (Zabbix, Wireshark, Cisco Packet Tracer, PuTTY)</w:t>
+      </w:r>
+    </w:p>
+    <w:p>
+      <w:pPr>
+        <w:spacing w:after="20"/>
+        <w:ind w:left="403"/>
+      </w:pPr>
+      <w:r>
+        <w:rPr>
+          <w:sz w:val="20"/>
+          <w:szCs w:val="20"/>
+        </w:rPr>
+        <w:t xml:space="preserve">▸ Compétences en programmation : Python, C, SQL/MySQL, CLI, JS/PHP (VS Code)</w:t>
+      </w:r>
+    </w:p>
+    <w:p>
+      <w:pPr>
+        <w:spacing w:after="20"/>
+        <w:ind w:left="403"/>
+      </w:pPr>
+      <w:r>
+        <w:rPr>
+          <w:sz w:val="20"/>
+          <w:szCs w:val="20"/>
+        </w:rPr>
+        <w:t xml:space="preserve">▸ Compétences en électronique : circuits, composants et systèmes embarqués (Node-RED, Arduino IDE)</w:t>
+      </w:r>
+    </w:p>
+    <w:p>
+      <w:pPr>
+        <w:spacing w:after="20"/>
+        <w:ind w:left="403"/>
+      </w:pPr>
+      <w:r>
+        <w:rPr>
+          <w:sz w:val="20"/>
+          <w:szCs w:val="20"/>
+        </w:rPr>
+        <w:t xml:space="preserve">▸ Compétences bureautique / ticketing (Microsoft Office, Hubspot CRM)</w:t>
+      </w:r>
+    </w:p>
+    <w:p>
+      <w:pPr>
+        <w:spacing w:after="20"/>
+        <w:ind w:left="403"/>
+      </w:pPr>
+      <w:r>
+        <w:rPr>
+          <w:sz w:val="20"/>
+          <w:szCs w:val="20"/>
+        </w:rPr>
+        <w:t xml:space="preserve">▸ Compétences DevOps / Déploiement CI/CD (Git, GitHub, Vercel)</w:t>
       </w:r>
     </w:p>
     <w:p>
       <w:pPr>
         <w:tabs>
-          <w:tab w:val="right" w:pos="9936"/>
+          <w:tab w:val="right" w:pos="9360"/>
         </w:tabs>
-        <w:spacing w:after="10" w:before="140"/>
-      </w:pPr>
-      <w:r>
-        <w:rPr>
-          <w:rFonts w:ascii="Calibri" w:cs="Calibri" w:eastAsia="Calibri" w:hAnsi="Calibri"/>
-          <w:b/>
-          <w:bCs/>
-          <w:color w:val="1A1A1A"/>
+        <w:spacing w:after="0" w:before="140"/>
+      </w:pPr>
+      <w:r>
+        <w:rPr>
+          <w:b/>
+          <w:bCs/>
           <w:sz w:val="21"/>
           <w:szCs w:val="21"/>
         </w:rPr>
@@ -236,7 +277,6 @@
       </w:r>
       <w:r>
         <w:rPr>
-          <w:rFonts w:ascii="Calibri" w:cs="Calibri" w:eastAsia="Calibri" w:hAnsi="Calibri"/>
           <w:i/>
           <w:iCs/>
           <w:color w:val="808080"/>
@@ -248,14 +288,13 @@
     </w:p>
     <w:p>
       <w:pPr>
-        <w:spacing w:after="50"/>
-      </w:pPr>
-      <w:r>
-        <w:rPr>
-          <w:rFonts w:ascii="Calibri" w:cs="Calibri" w:eastAsia="Calibri" w:hAnsi="Calibri"/>
+        <w:spacing w:after="40"/>
+      </w:pPr>
+      <w:r>
+        <w:rPr>
           <w:i/>
           <w:iCs/>
-          <w:color w:val="4A7B93"/>
+          <w:color w:val="5B7A8C"/>
           <w:sz w:val="19"/>
           <w:szCs w:val="19"/>
         </w:rPr>
@@ -264,62 +303,41 @@
     </w:p>
     <w:p>
       <w:pPr>
-        <w:spacing w:after="30"/>
-        <w:ind w:left="316"/>
-      </w:pPr>
-      <w:r>
-        <w:rPr>
-          <w:rFonts w:ascii="Calibri" w:cs="Calibri" w:eastAsia="Calibri" w:hAnsi="Calibri"/>
-          <w:color w:val="262626"/>
-          <w:sz w:val="19"/>
-          <w:szCs w:val="19"/>
-        </w:rPr>
-        <w:t xml:space="preserve">▸  Statistiques et probabilités : application des lois de probabilités à l'analyse de données</w:t>
-      </w:r>
-    </w:p>
-    <w:p>
-      <w:pPr>
-        <w:spacing w:after="30"/>
-        <w:ind w:left="316"/>
-      </w:pPr>
-      <w:r>
-        <w:rPr>
-          <w:rFonts w:ascii="Calibri" w:cs="Calibri" w:eastAsia="Calibri" w:hAnsi="Calibri"/>
-          <w:color w:val="262626"/>
-          <w:sz w:val="19"/>
-          <w:szCs w:val="19"/>
-        </w:rPr>
-        <w:t xml:space="preserve">▸  Bureautique : Microsoft Office (Word, Excel, PowerPoint, Access)</w:t>
-      </w:r>
-    </w:p>
-    <w:p>
-      <w:pPr>
-        <w:spacing w:after="30"/>
-        <w:ind w:left="316"/>
-      </w:pPr>
-      <w:r>
-        <w:rPr>
-          <w:rFonts w:ascii="Calibri" w:cs="Calibri" w:eastAsia="Calibri" w:hAnsi="Calibri"/>
-          <w:color w:val="262626"/>
-          <w:sz w:val="19"/>
-          <w:szCs w:val="19"/>
-        </w:rPr>
-        <w:t xml:space="preserve">▸  Capacité d'adaptation et d'organisation face à des exigences académiques variées</w:t>
+        <w:spacing w:after="20"/>
+        <w:ind w:left="403"/>
+      </w:pPr>
+      <w:r>
+        <w:rPr>
+          <w:sz w:val="20"/>
+          <w:szCs w:val="20"/>
+        </w:rPr>
+        <w:t xml:space="preserve">▸ Statistiques et probabilités : application des lois de probabilités à l'analyse de données</w:t>
+      </w:r>
+    </w:p>
+    <w:p>
+      <w:pPr>
+        <w:spacing w:after="20"/>
+        <w:ind w:left="403"/>
+      </w:pPr>
+      <w:r>
+        <w:rPr>
+          <w:sz w:val="20"/>
+          <w:szCs w:val="20"/>
+        </w:rPr>
+        <w:t xml:space="preserve">▸ Informatique décisionnelle : SGBD et reporting (Microsoft SQL Server / Power BI)</w:t>
       </w:r>
     </w:p>
     <w:p>
       <w:pPr>
         <w:tabs>
-          <w:tab w:val="right" w:pos="9936"/>
+          <w:tab w:val="right" w:pos="9360"/>
         </w:tabs>
-        <w:spacing w:after="10" w:before="140"/>
-      </w:pPr>
-      <w:r>
-        <w:rPr>
-          <w:rFonts w:ascii="Calibri" w:cs="Calibri" w:eastAsia="Calibri" w:hAnsi="Calibri"/>
-          <w:b/>
-          <w:bCs/>
-          <w:color w:val="1A1A1A"/>
+        <w:spacing w:after="0" w:before="140"/>
+      </w:pPr>
+      <w:r>
+        <w:rPr>
+          <w:b/>
+          <w:bCs/>
           <w:sz w:val="21"/>
           <w:szCs w:val="21"/>
         </w:rPr>
@@ -327,7 +345,6 @@
       </w:r>
       <w:r>
         <w:rPr>
-          <w:rFonts w:ascii="Calibri" w:cs="Calibri" w:eastAsia="Calibri" w:hAnsi="Calibri"/>
           <w:i/>
           <w:iCs/>
           <w:color w:val="808080"/>
@@ -339,14 +356,13 @@
     </w:p>
     <w:p>
       <w:pPr>
-        <w:spacing w:after="50"/>
-      </w:pPr>
-      <w:r>
-        <w:rPr>
-          <w:rFonts w:ascii="Calibri" w:cs="Calibri" w:eastAsia="Calibri" w:hAnsi="Calibri"/>
+        <w:spacing w:after="40"/>
+      </w:pPr>
+      <w:r>
+        <w:rPr>
           <w:i/>
           <w:iCs/>
-          <w:color w:val="4A7B93"/>
+          <w:color w:val="5B7A8C"/>
           <w:sz w:val="19"/>
           <w:szCs w:val="19"/>
         </w:rPr>
@@ -356,18 +372,17 @@
     <w:p>
       <w:pPr>
         <w:pBdr>
-          <w:bottom w:val="single" w:color="BFCCD1" w:sz="4" w:space="4"/>
+          <w:bottom w:val="single" w:color="BFBFBF" w:sz="4" w:space="4"/>
         </w:pBdr>
-        <w:spacing w:after="100" w:before="280"/>
-      </w:pPr>
-      <w:r>
-        <w:rPr>
-          <w:rFonts w:ascii="Calibri" w:cs="Calibri" w:eastAsia="Calibri" w:hAnsi="Calibri"/>
-          <w:b/>
-          <w:bCs/>
-          <w:color w:val="1F3F52"/>
-          <w:sz w:val="24"/>
-          <w:szCs w:val="24"/>
+        <w:spacing w:after="100" w:before="260"/>
+      </w:pPr>
+      <w:r>
+        <w:rPr>
+          <w:b/>
+          <w:bCs/>
+          <w:color w:val="2C3E50"/>
+          <w:sz w:val="22"/>
+          <w:szCs w:val="22"/>
         </w:rPr>
         <w:t xml:space="preserve">EXPÉRIENCE PROFESSIONNELLE</w:t>
       </w:r>
@@ -375,16 +390,14 @@
     <w:p>
       <w:pPr>
         <w:tabs>
-          <w:tab w:val="right" w:pos="9936"/>
+          <w:tab w:val="right" w:pos="9360"/>
         </w:tabs>
-        <w:spacing w:after="10" w:before="140"/>
-      </w:pPr>
-      <w:r>
-        <w:rPr>
-          <w:rFonts w:ascii="Calibri" w:cs="Calibri" w:eastAsia="Calibri" w:hAnsi="Calibri"/>
-          <w:b/>
-          <w:bCs/>
-          <w:color w:val="1A1A1A"/>
+        <w:spacing w:after="0" w:before="140"/>
+      </w:pPr>
+      <w:r>
+        <w:rPr>
+          <w:b/>
+          <w:bCs/>
           <w:sz w:val="21"/>
           <w:szCs w:val="21"/>
         </w:rPr>
@@ -392,7 +405,6 @@
       </w:r>
       <w:r>
         <w:rPr>
-          <w:rFonts w:ascii="Calibri" w:cs="Calibri" w:eastAsia="Calibri" w:hAnsi="Calibri"/>
           <w:i/>
           <w:iCs/>
           <w:color w:val="808080"/>
@@ -404,14 +416,13 @@
     </w:p>
     <w:p>
       <w:pPr>
-        <w:spacing w:after="50"/>
-      </w:pPr>
-      <w:r>
-        <w:rPr>
-          <w:rFonts w:ascii="Calibri" w:cs="Calibri" w:eastAsia="Calibri" w:hAnsi="Calibri"/>
+        <w:spacing w:after="40"/>
+      </w:pPr>
+      <w:r>
+        <w:rPr>
           <w:i/>
           <w:iCs/>
-          <w:color w:val="4A7B93"/>
+          <w:color w:val="5B7A8C"/>
           <w:sz w:val="19"/>
           <w:szCs w:val="19"/>
         </w:rPr>
@@ -420,214 +431,189 @@
     </w:p>
     <w:p>
       <w:pPr>
-        <w:spacing w:after="30"/>
-        <w:ind w:left="316"/>
-      </w:pPr>
-      <w:r>
-        <w:rPr>
-          <w:rFonts w:ascii="Calibri" w:cs="Calibri" w:eastAsia="Calibri" w:hAnsi="Calibri"/>
-          <w:color w:val="262626"/>
-          <w:sz w:val="19"/>
-          <w:szCs w:val="19"/>
-        </w:rPr>
-        <w:t xml:space="preserve">▸  Rigueur et sang-froid sur des interventions à enjeux réels, sans marge d’erreur tolérée</w:t>
-      </w:r>
-    </w:p>
-    <w:p>
-      <w:pPr>
-        <w:spacing w:after="30"/>
-        <w:ind w:left="316"/>
-      </w:pPr>
-      <w:r>
-        <w:rPr>
-          <w:rFonts w:ascii="Calibri" w:cs="Calibri" w:eastAsia="Calibri" w:hAnsi="Calibri"/>
-          <w:color w:val="262626"/>
-          <w:sz w:val="19"/>
-          <w:szCs w:val="19"/>
-        </w:rPr>
-        <w:t xml:space="preserve">▸  Prise en main rapide de missions concrètes sur des outils et équipements inconnus</w:t>
-      </w:r>
-    </w:p>
-    <w:p>
-      <w:pPr>
-        <w:spacing w:after="30"/>
-        <w:ind w:left="316"/>
-      </w:pPr>
-      <w:r>
-        <w:rPr>
-          <w:rFonts w:ascii="Calibri" w:cs="Calibri" w:eastAsia="Calibri" w:hAnsi="Calibri"/>
-          <w:color w:val="262626"/>
-          <w:sz w:val="19"/>
-          <w:szCs w:val="19"/>
-        </w:rPr>
-        <w:t xml:space="preserve">▸  Sens du service, ponctualité et esprit d'équipe reconnus par l'entreprise d'accueil</w:t>
+        <w:spacing w:after="20"/>
+        <w:ind w:left="403"/>
+      </w:pPr>
+      <w:r>
+        <w:rPr>
+          <w:sz w:val="20"/>
+          <w:szCs w:val="20"/>
+        </w:rPr>
+        <w:t xml:space="preserve">▸ Rigueur et sang-froid sur des interventions à enjeux réels, sans marge d'erreur tolérée</w:t>
+      </w:r>
+    </w:p>
+    <w:p>
+      <w:pPr>
+        <w:spacing w:after="20"/>
+        <w:ind w:left="403"/>
+      </w:pPr>
+      <w:r>
+        <w:rPr>
+          <w:sz w:val="20"/>
+          <w:szCs w:val="20"/>
+        </w:rPr>
+        <w:t xml:space="preserve">▸ Prise en main rapide de missions concrètes sur des outils et équipements inconnus</w:t>
+      </w:r>
+    </w:p>
+    <w:p>
+      <w:pPr>
+        <w:spacing w:after="20"/>
+        <w:ind w:left="403"/>
+      </w:pPr>
+      <w:r>
+        <w:rPr>
+          <w:sz w:val="20"/>
+          <w:szCs w:val="20"/>
+        </w:rPr>
+        <w:t xml:space="preserve">▸ Sens du service, ponctualité et esprit d'équipe reconnus par l'entreprise d'accueil</w:t>
       </w:r>
     </w:p>
     <w:p>
       <w:pPr>
         <w:pBdr>
-          <w:bottom w:val="single" w:color="BFCCD1" w:sz="4" w:space="4"/>
+          <w:bottom w:val="single" w:color="BFBFBF" w:sz="4" w:space="4"/>
         </w:pBdr>
-        <w:spacing w:after="100" w:before="280"/>
-      </w:pPr>
-      <w:r>
-        <w:rPr>
-          <w:rFonts w:ascii="Calibri" w:cs="Calibri" w:eastAsia="Calibri" w:hAnsi="Calibri"/>
-          <w:b/>
-          <w:bCs/>
-          <w:color w:val="1F3F52"/>
-          <w:sz w:val="24"/>
-          <w:szCs w:val="24"/>
+        <w:spacing w:after="100" w:before="260"/>
+      </w:pPr>
+      <w:r>
+        <w:rPr>
+          <w:b/>
+          <w:bCs/>
+          <w:color w:val="2C3E50"/>
+          <w:sz w:val="22"/>
+          <w:szCs w:val="22"/>
         </w:rPr>
         <w:t xml:space="preserve">QUALITÉS &amp; SAVOIR-ÊTRE</w:t>
       </w:r>
     </w:p>
     <w:p>
       <w:pPr>
-        <w:spacing w:after="60"/>
-      </w:pPr>
-      <w:r>
-        <w:rPr>
-          <w:rFonts w:ascii="Calibri" w:cs="Calibri" w:eastAsia="Calibri" w:hAnsi="Calibri"/>
-          <w:b/>
-          <w:bCs/>
-          <w:color w:val="1F3F52"/>
-          <w:sz w:val="19"/>
-          <w:szCs w:val="19"/>
+        <w:spacing w:after="40"/>
+      </w:pPr>
+      <w:r>
+        <w:rPr>
+          <w:b/>
+          <w:bCs/>
+          <w:color w:val="2C3E50"/>
+          <w:sz w:val="20"/>
+          <w:szCs w:val="20"/>
         </w:rPr>
         <w:t xml:space="preserve">Sens du contact : </w:t>
       </w:r>
       <w:r>
         <w:rPr>
-          <w:rFonts w:ascii="Calibri" w:cs="Calibri" w:eastAsia="Calibri" w:hAnsi="Calibri"/>
-          <w:color w:val="262626"/>
-          <w:sz w:val="19"/>
-          <w:szCs w:val="19"/>
+          <w:sz w:val="20"/>
+          <w:szCs w:val="20"/>
         </w:rPr>
         <w:t xml:space="preserve">accueil, écoute et amabilité envers la clientèle</w:t>
       </w:r>
     </w:p>
     <w:p>
       <w:pPr>
-        <w:spacing w:after="60"/>
-      </w:pPr>
-      <w:r>
-        <w:rPr>
-          <w:rFonts w:ascii="Calibri" w:cs="Calibri" w:eastAsia="Calibri" w:hAnsi="Calibri"/>
-          <w:b/>
-          <w:bCs/>
-          <w:color w:val="1F3F52"/>
-          <w:sz w:val="19"/>
-          <w:szCs w:val="19"/>
+        <w:spacing w:after="40"/>
+      </w:pPr>
+      <w:r>
+        <w:rPr>
+          <w:b/>
+          <w:bCs/>
+          <w:color w:val="2C3E50"/>
+          <w:sz w:val="20"/>
+          <w:szCs w:val="20"/>
         </w:rPr>
         <w:t xml:space="preserve">Rigueur &amp; organisation : </w:t>
       </w:r>
       <w:r>
         <w:rPr>
-          <w:rFonts w:ascii="Calibri" w:cs="Calibri" w:eastAsia="Calibri" w:hAnsi="Calibri"/>
-          <w:color w:val="262626"/>
-          <w:sz w:val="19"/>
-          <w:szCs w:val="19"/>
+          <w:sz w:val="20"/>
+          <w:szCs w:val="20"/>
         </w:rPr>
         <w:t xml:space="preserve">fiabilité dans l'exécution des tâches confiées</w:t>
       </w:r>
     </w:p>
     <w:p>
       <w:pPr>
-        <w:spacing w:after="60"/>
-      </w:pPr>
-      <w:r>
-        <w:rPr>
-          <w:rFonts w:ascii="Calibri" w:cs="Calibri" w:eastAsia="Calibri" w:hAnsi="Calibri"/>
-          <w:b/>
-          <w:bCs/>
-          <w:color w:val="1F3F52"/>
-          <w:sz w:val="19"/>
-          <w:szCs w:val="19"/>
+        <w:spacing w:after="40"/>
+      </w:pPr>
+      <w:r>
+        <w:rPr>
+          <w:b/>
+          <w:bCs/>
+          <w:color w:val="2C3E50"/>
+          <w:sz w:val="20"/>
+          <w:szCs w:val="20"/>
         </w:rPr>
         <w:t xml:space="preserve">Esprit d'équipe : </w:t>
       </w:r>
       <w:r>
         <w:rPr>
-          <w:rFonts w:ascii="Calibri" w:cs="Calibri" w:eastAsia="Calibri" w:hAnsi="Calibri"/>
-          <w:color w:val="262626"/>
-          <w:sz w:val="19"/>
-          <w:szCs w:val="19"/>
+          <w:sz w:val="20"/>
+          <w:szCs w:val="20"/>
         </w:rPr>
         <w:t xml:space="preserve">habitué au travail collectif et à l'entraide</w:t>
       </w:r>
     </w:p>
     <w:p>
       <w:pPr>
-        <w:spacing w:after="60"/>
-      </w:pPr>
-      <w:r>
-        <w:rPr>
-          <w:rFonts w:ascii="Calibri" w:cs="Calibri" w:eastAsia="Calibri" w:hAnsi="Calibri"/>
-          <w:b/>
-          <w:bCs/>
-          <w:color w:val="1F3F52"/>
-          <w:sz w:val="19"/>
-          <w:szCs w:val="19"/>
+        <w:spacing w:after="40"/>
+      </w:pPr>
+      <w:r>
+        <w:rPr>
+          <w:b/>
+          <w:bCs/>
+          <w:color w:val="2C3E50"/>
+          <w:sz w:val="20"/>
+          <w:szCs w:val="20"/>
         </w:rPr>
         <w:t xml:space="preserve">Réactivité : </w:t>
       </w:r>
       <w:r>
         <w:rPr>
-          <w:rFonts w:ascii="Calibri" w:cs="Calibri" w:eastAsia="Calibri" w:hAnsi="Calibri"/>
-          <w:color w:val="262626"/>
-          <w:sz w:val="19"/>
-          <w:szCs w:val="19"/>
+          <w:sz w:val="20"/>
+          <w:szCs w:val="20"/>
         </w:rPr>
         <w:t xml:space="preserve">capacité à gérer plusieurs tâches et à travailler sous rythme soutenu</w:t>
       </w:r>
     </w:p>
     <w:p>
       <w:pPr>
-        <w:spacing w:after="60"/>
-      </w:pPr>
-      <w:r>
-        <w:rPr>
-          <w:rFonts w:ascii="Calibri" w:cs="Calibri" w:eastAsia="Calibri" w:hAnsi="Calibri"/>
-          <w:b/>
-          <w:bCs/>
-          <w:color w:val="1F3F52"/>
-          <w:sz w:val="19"/>
-          <w:szCs w:val="19"/>
+        <w:spacing w:after="40"/>
+      </w:pPr>
+      <w:r>
+        <w:rPr>
+          <w:b/>
+          <w:bCs/>
+          <w:color w:val="2C3E50"/>
+          <w:sz w:val="20"/>
+          <w:szCs w:val="20"/>
         </w:rPr>
         <w:t xml:space="preserve">Ponctualité &amp; fiabilité : </w:t>
       </w:r>
       <w:r>
         <w:rPr>
-          <w:rFonts w:ascii="Calibri" w:cs="Calibri" w:eastAsia="Calibri" w:hAnsi="Calibri"/>
-          <w:color w:val="262626"/>
-          <w:sz w:val="19"/>
-          <w:szCs w:val="19"/>
+          <w:sz w:val="20"/>
+          <w:szCs w:val="20"/>
         </w:rPr>
         <w:t xml:space="preserve">assiduité et respect des horaires</w:t>
       </w:r>
     </w:p>
     <w:p>
       <w:pPr>
-        <w:spacing w:after="60"/>
-      </w:pPr>
-      <w:r>
-        <w:rPr>
-          <w:rFonts w:ascii="Calibri" w:cs="Calibri" w:eastAsia="Calibri" w:hAnsi="Calibri"/>
-          <w:b/>
-          <w:bCs/>
-          <w:color w:val="1F3F52"/>
-          <w:sz w:val="19"/>
-          <w:szCs w:val="19"/>
+        <w:spacing w:after="40"/>
+      </w:pPr>
+      <w:r>
+        <w:rPr>
+          <w:b/>
+          <w:bCs/>
+          <w:color w:val="2C3E50"/>
+          <w:sz w:val="20"/>
+          <w:szCs w:val="20"/>
         </w:rPr>
         <w:t xml:space="preserve">Polyvalence : </w:t>
       </w:r>
       <w:r>
         <w:rPr>
-          <w:rFonts w:ascii="Calibri" w:cs="Calibri" w:eastAsia="Calibri" w:hAnsi="Calibri"/>
-          <w:color w:val="262626"/>
-          <w:sz w:val="19"/>
-          <w:szCs w:val="19"/>
+          <w:sz w:val="20"/>
+          <w:szCs w:val="20"/>
         </w:rPr>
         <w:t xml:space="preserve">adaptation rapide à de nouvelles consignes et environnements</w:t>
       </w:r>
@@ -635,68 +621,61 @@
     <w:p>
       <w:pPr>
         <w:pBdr>
-          <w:bottom w:val="single" w:color="BFCCD1" w:sz="4" w:space="4"/>
+          <w:bottom w:val="single" w:color="BFBFBF" w:sz="4" w:space="4"/>
         </w:pBdr>
-        <w:spacing w:after="100" w:before="280"/>
-      </w:pPr>
-      <w:r>
-        <w:rPr>
-          <w:rFonts w:ascii="Calibri" w:cs="Calibri" w:eastAsia="Calibri" w:hAnsi="Calibri"/>
-          <w:b/>
-          <w:bCs/>
-          <w:color w:val="1F3F52"/>
-          <w:sz w:val="24"/>
-          <w:szCs w:val="24"/>
+        <w:spacing w:after="100" w:before="260"/>
+      </w:pPr>
+      <w:r>
+        <w:rPr>
+          <w:b/>
+          <w:bCs/>
+          <w:color w:val="2C3E50"/>
+          <w:sz w:val="22"/>
+          <w:szCs w:val="22"/>
         </w:rPr>
         <w:t xml:space="preserve">LANGUES</w:t>
       </w:r>
     </w:p>
     <w:p>
       <w:pPr>
-        <w:spacing w:after="60"/>
-      </w:pPr>
-      <w:r>
-        <w:rPr>
-          <w:rFonts w:ascii="Calibri" w:cs="Calibri" w:eastAsia="Calibri" w:hAnsi="Calibri"/>
-          <w:b/>
-          <w:bCs/>
-          <w:color w:val="1F3F52"/>
-          <w:sz w:val="19"/>
-          <w:szCs w:val="19"/>
+        <w:spacing w:after="40"/>
+      </w:pPr>
+      <w:r>
+        <w:rPr>
+          <w:b/>
+          <w:bCs/>
+          <w:color w:val="2C3E50"/>
+          <w:sz w:val="20"/>
+          <w:szCs w:val="20"/>
         </w:rPr>
         <w:t xml:space="preserve">Anglais : </w:t>
       </w:r>
       <w:r>
         <w:rPr>
-          <w:rFonts w:ascii="Calibri" w:cs="Calibri" w:eastAsia="Calibri" w:hAnsi="Calibri"/>
-          <w:color w:val="262626"/>
-          <w:sz w:val="19"/>
-          <w:szCs w:val="19"/>
+          <w:sz w:val="20"/>
+          <w:szCs w:val="20"/>
         </w:rPr>
         <w:t xml:space="preserve">B1 certifié</w:t>
       </w:r>
     </w:p>
     <w:p>
       <w:pPr>
-        <w:spacing w:after="60"/>
-      </w:pPr>
-      <w:r>
-        <w:rPr>
-          <w:rFonts w:ascii="Calibri" w:cs="Calibri" w:eastAsia="Calibri" w:hAnsi="Calibri"/>
-          <w:b/>
-          <w:bCs/>
-          <w:color w:val="1F3F52"/>
-          <w:sz w:val="19"/>
-          <w:szCs w:val="19"/>
+        <w:spacing w:after="40"/>
+      </w:pPr>
+      <w:r>
+        <w:rPr>
+          <w:b/>
+          <w:bCs/>
+          <w:color w:val="2C3E50"/>
+          <w:sz w:val="20"/>
+          <w:szCs w:val="20"/>
         </w:rPr>
         <w:t xml:space="preserve">Allemand : </w:t>
       </w:r>
       <w:r>
         <w:rPr>
-          <w:rFonts w:ascii="Calibri" w:cs="Calibri" w:eastAsia="Calibri" w:hAnsi="Calibri"/>
-          <w:color w:val="262626"/>
-          <w:sz w:val="19"/>
-          <w:szCs w:val="19"/>
+          <w:sz w:val="20"/>
+          <w:szCs w:val="20"/>
         </w:rPr>
         <w:t xml:space="preserve">A2+ certifié</w:t>
       </w:r>
@@ -704,18 +683,17 @@
     <w:p>
       <w:pPr>
         <w:pBdr>
-          <w:bottom w:val="single" w:color="BFCCD1" w:sz="4" w:space="4"/>
+          <w:bottom w:val="single" w:color="BFBFBF" w:sz="4" w:space="4"/>
         </w:pBdr>
-        <w:spacing w:after="100" w:before="280"/>
-      </w:pPr>
-      <w:r>
-        <w:rPr>
-          <w:rFonts w:ascii="Calibri" w:cs="Calibri" w:eastAsia="Calibri" w:hAnsi="Calibri"/>
-          <w:b/>
-          <w:bCs/>
-          <w:color w:val="1F3F52"/>
-          <w:sz w:val="24"/>
-          <w:szCs w:val="24"/>
+        <w:spacing w:after="100" w:before="260"/>
+      </w:pPr>
+      <w:r>
+        <w:rPr>
+          <w:b/>
+          <w:bCs/>
+          <w:color w:val="2C3E50"/>
+          <w:sz w:val="22"/>
+          <w:szCs w:val="22"/>
         </w:rPr>
         <w:t xml:space="preserve">CENTRES D'INTÉRÊT</w:t>
       </w:r>
@@ -726,73 +704,50 @@
       </w:pPr>
       <w:r>
         <w:rPr>
-          <w:rFonts w:ascii="Calibri" w:cs="Calibri" w:eastAsia="Calibri" w:hAnsi="Calibri"/>
-          <w:b/>
-          <w:bCs/>
-          <w:color w:val="1F3F52"/>
-          <w:sz w:val="19"/>
-          <w:szCs w:val="19"/>
-        </w:rPr>
-        <w:t xml:space="preserve">Tennis en compétition</w:t>
-      </w:r>
-      <w:r>
-        <w:rPr>
-          <w:rFonts w:ascii="Calibri" w:cs="Calibri" w:eastAsia="Calibri" w:hAnsi="Calibri"/>
-          <w:color w:val="262626"/>
-          <w:sz w:val="19"/>
-          <w:szCs w:val="19"/>
-        </w:rPr>
-        <w:t xml:space="preserve">  —  10 ans de pratique, esprit de compétition et dépassement de soi</w:t>
-      </w:r>
-    </w:p>
-    <w:p>
-      <w:pPr>
-        <w:spacing w:after="40"/>
-      </w:pPr>
-      <w:r>
-        <w:rPr>
-          <w:rFonts w:ascii="Calibri" w:cs="Calibri" w:eastAsia="Calibri" w:hAnsi="Calibri"/>
-          <w:b/>
-          <w:bCs/>
-          <w:color w:val="1F3F52"/>
-          <w:sz w:val="19"/>
-          <w:szCs w:val="19"/>
+          <w:b/>
+          <w:bCs/>
+          <w:color w:val="2C3E50"/>
+          <w:sz w:val="20"/>
+          <w:szCs w:val="20"/>
+        </w:rPr>
+        <w:t xml:space="preserve">Tennis en compétition   —   </w:t>
+      </w:r>
+      <w:r>
+        <w:rPr>
+          <w:sz w:val="20"/>
+          <w:szCs w:val="20"/>
+        </w:rPr>
+        <w:t xml:space="preserve">10 ans de pratique, esprit de compétition et dépassement de soi</w:t>
+      </w:r>
+    </w:p>
+    <w:p>
+      <w:pPr>
+        <w:spacing w:after="40"/>
+      </w:pPr>
+      <w:r>
+        <w:rPr>
+          <w:b/>
+          <w:bCs/>
+          <w:color w:val="2C3E50"/>
+          <w:sz w:val="20"/>
+          <w:szCs w:val="20"/>
         </w:rPr>
         <w:t xml:space="preserve">Passionné de cuisine</w:t>
       </w:r>
-      <w:r>
-        <w:rPr>
-          <w:rFonts w:ascii="Calibri" w:cs="Calibri" w:eastAsia="Calibri" w:hAnsi="Calibri"/>
-          <w:color w:val="262626"/>
-          <w:sz w:val="19"/>
-          <w:szCs w:val="19"/>
-        </w:rPr>
-        <w:t xml:space="preserve"/>
-      </w:r>
-    </w:p>
-    <w:p>
-      <w:pPr>
-        <w:spacing w:after="40"/>
-      </w:pPr>
-      <w:r>
-        <w:rPr>
-          <w:rFonts w:ascii="Calibri" w:cs="Calibri" w:eastAsia="Calibri" w:hAnsi="Calibri"/>
-          <w:b/>
-          <w:bCs/>
-          <w:color w:val="1F3F52"/>
-          <w:sz w:val="19"/>
-          <w:szCs w:val="19"/>
+    </w:p>
+    <w:p>
+      <w:pPr>
+        <w:spacing w:after="40"/>
+      </w:pPr>
+      <w:r>
+        <w:rPr>
+          <w:b/>
+          <w:bCs/>
+          <w:color w:val="2C3E50"/>
+          <w:sz w:val="20"/>
+          <w:szCs w:val="20"/>
         </w:rPr>
         <w:t xml:space="preserve">Veille informatique</w:t>
-      </w:r>
-      <w:r>
-        <w:rPr>
-          <w:rFonts w:ascii="Calibri" w:cs="Calibri" w:eastAsia="Calibri" w:hAnsi="Calibri"/>
-          <w:color w:val="262626"/>
-          <w:sz w:val="19"/>
-          <w:szCs w:val="19"/>
-        </w:rPr>
-        <w:t xml:space="preserve"/>
       </w:r>
     </w:p>
     <w:sectPr>

</xml_diff>

<commit_message>
Stage PFMP : remplacement par les missions réelles du rapport de stage (auto Python/SSH, migration SNMPv3, stack Aruba)
</commit_message>
<xml_diff>
--- a/CV/AIT_AMIR_Youssouf_CV_Generique.docx
+++ b/CV/AIT_AMIR_Youssouf_CV_Generique.docx
@@ -401,7 +401,7 @@
           <w:sz w:val="21"/>
           <w:szCs w:val="21"/>
         </w:rPr>
-        <w:t xml:space="preserve">Stage PFMP — Support technique &amp; relation client</w:t>
+        <w:t xml:space="preserve">Stage PFMP — Administration réseau &amp; cybersécurité</w:t>
       </w:r>
       <w:r>
         <w:rPr>
@@ -426,7 +426,7 @@
           <w:sz w:val="19"/>
           <w:szCs w:val="19"/>
         </w:rPr>
-        <w:t xml:space="preserve">Konica Minolta Business Solutions France — Saighin-en-Mélantois (59)</w:t>
+        <w:t xml:space="preserve">Konica Minolta Business Solutions France — Sainghin-en-Mélantois (59)</w:t>
       </w:r>
     </w:p>
     <w:p>
@@ -439,7 +439,7 @@
           <w:sz w:val="20"/>
           <w:szCs w:val="20"/>
         </w:rPr>
-        <w:t xml:space="preserve">▸ Rigueur et sang-froid sur des interventions à enjeux réels, sans marge d'erreur tolérée</w:t>
+        <w:t xml:space="preserve">▸ Développement de scripts Python (SSH) pour l'automatisation de la sauvegarde des configurations de switchs Cisco, HP et Aruba, avec chiffrement des identifiants</w:t>
       </w:r>
     </w:p>
     <w:p>
@@ -452,7 +452,7 @@
           <w:sz w:val="20"/>
           <w:szCs w:val="20"/>
         </w:rPr>
-        <w:t xml:space="preserve">▸ Prise en main rapide de missions concrètes sur des outils et équipements inconnus</w:t>
+        <w:t xml:space="preserve">▸ Migration de la supervision SNMP (v1/v2c) vers SNMPv3 sur l'ensemble des switchs de production d'un site client, avec rédaction du rapport technique et de l'inventaire associés</w:t>
       </w:r>
     </w:p>
     <w:p>
@@ -465,7 +465,7 @@
           <w:sz w:val="20"/>
           <w:szCs w:val="20"/>
         </w:rPr>
-        <w:t xml:space="preserve">▸ Sens du service, ponctualité et esprit d'équipe reconnus par l'entreprise d'accueil</w:t>
+        <w:t xml:space="preserve">▸ Mise en stack de switchs Aruba 2930F et observation d'interventions sur firewalls (filtrage, VPN, inspection de trafic)</w:t>
       </w:r>
     </w:p>
     <w:p>

</xml_diff>

<commit_message>
Stage PFMP : formulation moins technique des 3 puces
</commit_message>
<xml_diff>
--- a/CV/AIT_AMIR_Youssouf_CV_Generique.docx
+++ b/CV/AIT_AMIR_Youssouf_CV_Generique.docx
@@ -439,7 +439,7 @@
           <w:sz w:val="20"/>
           <w:szCs w:val="20"/>
         </w:rPr>
-        <w:t xml:space="preserve">▸ Développement de scripts Python (SSH) pour l'automatisation de la sauvegarde des configurations de switchs Cisco, HP et Aruba, avec chiffrement des identifiants</w:t>
+        <w:t xml:space="preserve">▸ Automatisation en Python de la sauvegarde des configurations réseau (switchs Cisco, HP, Aruba), avec sécurisation des accès</w:t>
       </w:r>
     </w:p>
     <w:p>
@@ -452,7 +452,7 @@
           <w:sz w:val="20"/>
           <w:szCs w:val="20"/>
         </w:rPr>
-        <w:t xml:space="preserve">▸ Migration de la supervision SNMP (v1/v2c) vers SNMPv3 sur l'ensemble des switchs de production d'un site client, avec rédaction du rapport technique et de l'inventaire associés</w:t>
+        <w:t xml:space="preserve">▸ Renforcement de la sécurité de la supervision réseau sur le site d'un client industriel, avec compte-rendu écrit</w:t>
       </w:r>
     </w:p>
     <w:p>
@@ -465,7 +465,7 @@
           <w:sz w:val="20"/>
           <w:szCs w:val="20"/>
         </w:rPr>
-        <w:t xml:space="preserve">▸ Mise en stack de switchs Aruba 2930F et observation d'interventions sur firewalls (filtrage, VPN, inspection de trafic)</w:t>
+        <w:t xml:space="preserve">▸ Participation à la mise en place d'équipements réseau redondants et découverte du rôle des pare-feux en entreprise</w:t>
       </w:r>
     </w:p>
     <w:p>

</xml_diff>

<commit_message>
Stage PFMP : correction marque HPE Aruba + précision SNMP
</commit_message>
<xml_diff>
--- a/CV/AIT_AMIR_Youssouf_CV_Generique.docx
+++ b/CV/AIT_AMIR_Youssouf_CV_Generique.docx
@@ -439,7 +439,7 @@
           <w:sz w:val="20"/>
           <w:szCs w:val="20"/>
         </w:rPr>
-        <w:t xml:space="preserve">▸ Automatisation en Python de la sauvegarde des configurations réseau (switchs Cisco, HP, Aruba), avec sécurisation des accès</w:t>
+        <w:t xml:space="preserve">▸ Automatisation en Python de la sauvegarde des configurations réseau (switchs Cisco, HPE Aruba), avec sécurisation des accès</w:t>
       </w:r>
     </w:p>
     <w:p>
@@ -452,7 +452,7 @@
           <w:sz w:val="20"/>
           <w:szCs w:val="20"/>
         </w:rPr>
-        <w:t xml:space="preserve">▸ Renforcement de la sécurité de la supervision réseau sur le site d'un client industriel, avec compte-rendu écrit</w:t>
+        <w:t xml:space="preserve">▸ Renforcement de la sécurité du protocole de supervision réseau (SNMP) sur le site d'un client industriel, avec compte-rendu écrit</w:t>
       </w:r>
     </w:p>
     <w:p>

</xml_diff>

<commit_message>
Stage PFMP : ajustements de formulation (chiffrement, site du client, Automatisation Python)
</commit_message>
<xml_diff>
--- a/CV/AIT_AMIR_Youssouf_CV_Generique.docx
+++ b/CV/AIT_AMIR_Youssouf_CV_Generique.docx
@@ -439,7 +439,7 @@
           <w:sz w:val="20"/>
           <w:szCs w:val="20"/>
         </w:rPr>
-        <w:t xml:space="preserve">▸ Automatisation en Python de la sauvegarde des configurations réseau (switchs Cisco, HPE Aruba), avec sécurisation des accès</w:t>
+        <w:t xml:space="preserve">▸ Automatisation Python de la sauvegarde des configurations réseau (switchs Cisco, HPE Aruba), avec chiffrement des accès</w:t>
       </w:r>
     </w:p>
     <w:p>
@@ -452,7 +452,7 @@
           <w:sz w:val="20"/>
           <w:szCs w:val="20"/>
         </w:rPr>
-        <w:t xml:space="preserve">▸ Renforcement de la sécurité du protocole de supervision réseau (SNMP) sur le site d'un client industriel, avec compte-rendu écrit</w:t>
+        <w:t xml:space="preserve">▸ Renforcement de la sécurité du protocole de supervision réseau (SNMP) sur le site du client, avec compte-rendu.</w:t>
       </w:r>
     </w:p>
     <w:p>

</xml_diff>

<commit_message>
Stage PFMP : 'Mise en place' au lieu de 'Participation', 1ere puce sur une ligne
</commit_message>
<xml_diff>
--- a/CV/AIT_AMIR_Youssouf_CV_Generique.docx
+++ b/CV/AIT_AMIR_Youssouf_CV_Generique.docx
@@ -439,7 +439,7 @@
           <w:sz w:val="20"/>
           <w:szCs w:val="20"/>
         </w:rPr>
-        <w:t xml:space="preserve">▸ Automatisation Python de la sauvegarde des configurations réseau (switchs Cisco, HPE Aruba), avec chiffrement des accès</w:t>
+        <w:t xml:space="preserve">▸ Automatisation Python de la sauvegarde des configs réseau (Cisco, HPE Aruba), avec chiffrement des accès</w:t>
       </w:r>
     </w:p>
     <w:p>
@@ -465,7 +465,7 @@
           <w:sz w:val="20"/>
           <w:szCs w:val="20"/>
         </w:rPr>
-        <w:t xml:space="preserve">▸ Participation à la mise en place d'équipements réseau redondants et découverte du rôle des pare-feux en entreprise</w:t>
+        <w:t xml:space="preserve">▸ Mise en place d'équipements réseau redondants et découverte du rôle des pare-feux en entreprise</w:t>
       </w:r>
     </w:p>
     <w:p>

</xml_diff>

<commit_message>
Qualités : suppression de 'Sens du contact' et 'Esprit d'équipe'
</commit_message>
<xml_diff>
--- a/CV/AIT_AMIR_Youssouf_CV_Generique.docx
+++ b/CV/AIT_AMIR_Youssouf_CV_Generique.docx
@@ -498,28 +498,6 @@
           <w:sz w:val="20"/>
           <w:szCs w:val="20"/>
         </w:rPr>
-        <w:t xml:space="preserve">Sens du contact : </w:t>
-      </w:r>
-      <w:r>
-        <w:rPr>
-          <w:sz w:val="20"/>
-          <w:szCs w:val="20"/>
-        </w:rPr>
-        <w:t xml:space="preserve">accueil, écoute et amabilité envers la clientèle</w:t>
-      </w:r>
-    </w:p>
-    <w:p>
-      <w:pPr>
-        <w:spacing w:after="40"/>
-      </w:pPr>
-      <w:r>
-        <w:rPr>
-          <w:b/>
-          <w:bCs/>
-          <w:color w:val="2C3E50"/>
-          <w:sz w:val="20"/>
-          <w:szCs w:val="20"/>
-        </w:rPr>
         <w:t xml:space="preserve">Rigueur &amp; organisation : </w:t>
       </w:r>
       <w:r>
@@ -528,28 +506,6 @@
           <w:szCs w:val="20"/>
         </w:rPr>
         <w:t xml:space="preserve">fiabilité dans l'exécution des tâches confiées</w:t>
-      </w:r>
-    </w:p>
-    <w:p>
-      <w:pPr>
-        <w:spacing w:after="40"/>
-      </w:pPr>
-      <w:r>
-        <w:rPr>
-          <w:b/>
-          <w:bCs/>
-          <w:color w:val="2C3E50"/>
-          <w:sz w:val="20"/>
-          <w:szCs w:val="20"/>
-        </w:rPr>
-        <w:t xml:space="preserve">Esprit d'équipe : </w:t>
-      </w:r>
-      <w:r>
-        <w:rPr>
-          <w:sz w:val="20"/>
-          <w:szCs w:val="20"/>
-        </w:rPr>
-        <w:t xml:space="preserve">habitué au travail collectif et à l'entraide</w:t>
       </w:r>
     </w:p>
     <w:p>

</xml_diff>

<commit_message>
Stage PFMP : ajout d'une puce sur l'écoute et l'adaptation aux besoins du client
</commit_message>
<xml_diff>
--- a/CV/AIT_AMIR_Youssouf_CV_Generique.docx
+++ b/CV/AIT_AMIR_Youssouf_CV_Generique.docx
@@ -439,6 +439,19 @@
           <w:sz w:val="20"/>
           <w:szCs w:val="20"/>
         </w:rPr>
+        <w:t xml:space="preserve">▸ Écoute et adaptation aux besoins spécifiques du client pour proposer des solutions adaptées à son environnement</w:t>
+      </w:r>
+    </w:p>
+    <w:p>
+      <w:pPr>
+        <w:spacing w:after="20"/>
+        <w:ind w:left="403"/>
+      </w:pPr>
+      <w:r>
+        <w:rPr>
+          <w:sz w:val="20"/>
+          <w:szCs w:val="20"/>
+        </w:rPr>
         <w:t xml:space="preserve">▸ Automatisation Python de la sauvegarde des configs réseau (Cisco, HPE Aruba), avec chiffrement des accès</w:t>
       </w:r>
     </w:p>

</xml_diff>

<commit_message>
BTS : ajout 'Installation de réseaux : VLAN, LAN, DNS, DHCP'
</commit_message>
<xml_diff>
--- a/CV/AIT_AMIR_Youssouf_CV_Generique.docx
+++ b/CV/AIT_AMIR_Youssouf_CV_Generique.docx
@@ -217,6 +217,19 @@
           <w:sz w:val="20"/>
           <w:szCs w:val="20"/>
         </w:rPr>
+        <w:t xml:space="preserve">▸ Installation de réseaux : VLAN, LAN, DNS, DHCP (Cisco Packet Tracer, PuTTY)</w:t>
+      </w:r>
+    </w:p>
+    <w:p>
+      <w:pPr>
+        <w:spacing w:after="20"/>
+        <w:ind w:left="403"/>
+      </w:pPr>
+      <w:r>
+        <w:rPr>
+          <w:sz w:val="20"/>
+          <w:szCs w:val="20"/>
+        </w:rPr>
         <w:t xml:space="preserve">▸ Compétences en programmation : Python, C, SQL/MySQL, CLI, JS/PHP (VS Code)</w:t>
       </w:r>
     </w:p>

</xml_diff>

<commit_message>
Ajout TypeScript aux langages de programmation, ville : Lille au lieu de La Madeleine
</commit_message>
<xml_diff>
--- a/CV/AIT_AMIR_Youssouf_CV_Generique.docx
+++ b/CV/AIT_AMIR_Youssouf_CV_Generique.docx
@@ -85,7 +85,7 @@
                 <w:sz w:val="20"/>
                 <w:szCs w:val="20"/>
               </w:rPr>
-              <w:t xml:space="preserve">La Madeleine (59)</w:t>
+              <w:t xml:space="preserve">Lille (59)</w:t>
             </w:r>
           </w:p>
           <w:p>
@@ -230,7 +230,7 @@
           <w:sz w:val="20"/>
           <w:szCs w:val="20"/>
         </w:rPr>
-        <w:t xml:space="preserve">▸ Compétences en programmation : Python, C, SQL/MySQL, CLI, JS/PHP (VS Code)</w:t>
+        <w:t xml:space="preserve">▸ Compétences en programmation : Python, C, SQL/MySQL, CLI, JS/TS/PHP (VS Code)</w:t>
       </w:r>
     </w:p>
     <w:p>

</xml_diff>